<commit_message>
sign date added to noting
</commit_message>
<xml_diff>
--- a/files/Noting.docx
+++ b/files/Noting.docx
@@ -226,6 +226,44 @@
         <w:jc w:val="both"/>
         <w:rPr>
           <w:rFonts w:ascii="Segoe UI" w:hAnsi="Segoe UI" w:cs="Segoe UI"/>
+          <w:sz w:val="16"/>
+          <w:szCs w:val="16"/>
+        </w:rPr>
+      </w:pPr>
+      <w:r>
+        <w:rPr>
+          <w:rFonts w:ascii="Segoe UI" w:hAnsi="Segoe UI" w:cs="Segoe UI"/>
+          <w:sz w:val="16"/>
+          <w:szCs w:val="16"/>
+        </w:rPr>
+        <w:t>(Deepak Soni)</w:t>
+      </w:r>
+    </w:p>
+    <w:p>
+      <w:pPr>
+        <w:spacing w:after="0" w:line="240" w:lineRule="auto"/>
+        <w:jc w:val="both"/>
+        <w:rPr>
+          <w:rFonts w:ascii="Segoe UI" w:hAnsi="Segoe UI" w:cs="Segoe UI"/>
+          <w:sz w:val="16"/>
+          <w:szCs w:val="16"/>
+        </w:rPr>
+      </w:pPr>
+      <w:r>
+        <w:rPr>
+          <w:rFonts w:ascii="Segoe UI" w:hAnsi="Segoe UI" w:cs="Segoe UI"/>
+          <w:sz w:val="16"/>
+          <w:szCs w:val="16"/>
+        </w:rPr>
+        <w:t>Assistant</w:t>
+      </w:r>
+    </w:p>
+    <w:p>
+      <w:pPr>
+        <w:spacing w:after="0"/>
+        <w:jc w:val="both"/>
+        <w:rPr>
+          <w:rFonts w:ascii="Segoe UI" w:hAnsi="Segoe UI" w:cs="Segoe UI"/>
           <w:sz w:val="20"/>
           <w:szCs w:val="20"/>
         </w:rPr>
@@ -233,78 +271,40 @@
       <w:r>
         <w:rPr>
           <w:rFonts w:ascii="Segoe UI" w:hAnsi="Segoe UI" w:cs="Segoe UI"/>
+          <w:sz w:val="16"/>
+          <w:szCs w:val="16"/>
+        </w:rPr>
+        <w:t>({{TODAY_DATE}})</w:t>
+      </w:r>
+      <w:r>
+        <w:rPr>
+          <w:rFonts w:ascii="Segoe UI" w:hAnsi="Segoe UI" w:cs="Segoe UI"/>
+          <w:sz w:val="16"/>
+          <w:szCs w:val="16"/>
+        </w:rPr>
+        <w:tab/>
+      </w:r>
+      <w:r>
+        <w:rPr>
+          <w:rFonts w:ascii="Segoe UI" w:hAnsi="Segoe UI" w:cs="Segoe UI"/>
           <w:sz w:val="20"/>
           <w:szCs w:val="20"/>
         </w:rPr>
-        <w:t>(Deepak Soni)</w:t>
-      </w:r>
-    </w:p>
-    <w:p>
-      <w:pPr>
-        <w:spacing w:after="0" w:line="240" w:lineRule="auto"/>
-        <w:jc w:val="both"/>
+        <w:tab/>
+      </w:r>
+      <w:r>
         <w:rPr>
           <w:rFonts w:ascii="Segoe UI" w:hAnsi="Segoe UI" w:cs="Segoe UI"/>
           <w:sz w:val="20"/>
           <w:szCs w:val="20"/>
         </w:rPr>
-      </w:pPr>
-      <w:r>
-        <w:rPr>
-          <w:rFonts w:ascii="Segoe UI" w:hAnsi="Segoe UI" w:cs="Segoe UI"/>
-          <w:sz w:val="20"/>
-          <w:szCs w:val="20"/>
-        </w:rPr>
-        <w:t>Assistant</w:t>
+        <w:tab/>
       </w:r>
     </w:p>
     <w:p>
       <w:pPr>
         <w:spacing w:after="0"/>
-        <w:jc w:val="both"/>
-        <w:rPr>
-          <w:rFonts w:ascii="Segoe UI" w:hAnsi="Segoe UI" w:cs="Segoe UI"/>
-          <w:sz w:val="20"/>
-          <w:szCs w:val="20"/>
-        </w:rPr>
-      </w:pPr>
-      <w:r>
-        <w:rPr>
-          <w:rFonts w:ascii="Segoe UI" w:hAnsi="Segoe UI" w:cs="Segoe UI"/>
-          <w:sz w:val="20"/>
-          <w:szCs w:val="20"/>
-        </w:rPr>
-        <w:t>({{TODAY_DATE}})</w:t>
-      </w:r>
-      <w:r>
-        <w:rPr>
-          <w:rFonts w:ascii="Segoe UI" w:hAnsi="Segoe UI" w:cs="Segoe UI"/>
-          <w:sz w:val="20"/>
-          <w:szCs w:val="20"/>
-        </w:rPr>
-        <w:tab/>
-      </w:r>
-      <w:r>
-        <w:rPr>
-          <w:rFonts w:ascii="Segoe UI" w:hAnsi="Segoe UI" w:cs="Segoe UI"/>
-          <w:sz w:val="20"/>
-          <w:szCs w:val="20"/>
-        </w:rPr>
-        <w:tab/>
-      </w:r>
-      <w:r>
-        <w:rPr>
-          <w:rFonts w:ascii="Segoe UI" w:hAnsi="Segoe UI" w:cs="Segoe UI"/>
-          <w:sz w:val="20"/>
-          <w:szCs w:val="20"/>
-        </w:rPr>
-        <w:tab/>
-      </w:r>
-    </w:p>
-    <w:p>
-      <w:pPr>
-        <w:spacing w:after="0"/>
-        <w:ind w:left="1440" w:firstLine="720"/>
+        <w:ind w:left="1440" w:firstLine="270"/>
         <w:jc w:val="both"/>
         <w:rPr>
           <w:rFonts w:ascii="Segoe UI" w:hAnsi="Segoe UI" w:cs="Segoe UI"/>

</xml_diff>

<commit_message>
added dealing in noting
</commit_message>
<xml_diff>
--- a/files/Noting.docx
+++ b/files/Noting.docx
@@ -26,6 +26,15 @@
       <w:r>
         <w:rPr>
           <w:rFonts w:ascii="Segoe UI" w:hAnsi="Segoe UI" w:cs="Segoe UI"/>
+          <w:b/>
+          <w:sz w:val="24"/>
+          <w:szCs w:val="24"/>
+        </w:rPr>
+        <w:t xml:space="preserve">   </w:t>
+      </w:r>
+      <w:r>
+        <w:rPr>
+          <w:rFonts w:ascii="Segoe UI" w:hAnsi="Segoe UI" w:cs="Segoe UI"/>
           <w:bCs/>
         </w:rPr>
         <w:t xml:space="preserve">File No. </w:t>
@@ -137,61 +146,7 @@
           <w:sz w:val="24"/>
           <w:szCs w:val="24"/>
         </w:rPr>
-        <w:t>{{FIRST_PARA}}</w:t>
-      </w:r>
-    </w:p>
-    <w:p>
-      <w:pPr>
-        <w:jc w:val="both"/>
-        <w:rPr>
-          <w:rFonts w:ascii="Segoe UI" w:hAnsi="Segoe UI" w:cs="Segoe UI"/>
-          <w:sz w:val="24"/>
-          <w:szCs w:val="24"/>
-        </w:rPr>
-      </w:pPr>
-      <w:r>
-        <w:rPr>
-          <w:rFonts w:ascii="Segoe UI" w:hAnsi="Segoe UI" w:cs="Segoe UI"/>
-          <w:sz w:val="24"/>
-          <w:szCs w:val="24"/>
-        </w:rPr>
-        <w:tab/>
-      </w:r>
-      <w:r>
-        <w:rPr>
-          <w:rFonts w:ascii="Segoe UI" w:hAnsi="Segoe UI" w:cs="Segoe UI"/>
-          <w:sz w:val="24"/>
-          <w:szCs w:val="24"/>
-        </w:rPr>
-        <w:tab/>
-        <w:t>{{MID_PARA}}</w:t>
-      </w:r>
-    </w:p>
-    <w:p>
-      <w:pPr>
-        <w:jc w:val="both"/>
-        <w:rPr>
-          <w:rFonts w:ascii="Segoe UI" w:hAnsi="Segoe UI" w:cs="Segoe UI"/>
-          <w:sz w:val="24"/>
-          <w:szCs w:val="24"/>
-        </w:rPr>
-      </w:pPr>
-      <w:r>
-        <w:rPr>
-          <w:rFonts w:ascii="Segoe UI" w:hAnsi="Segoe UI" w:cs="Segoe UI"/>
-          <w:sz w:val="24"/>
-          <w:szCs w:val="24"/>
-        </w:rPr>
-        <w:tab/>
-      </w:r>
-      <w:r>
-        <w:rPr>
-          <w:rFonts w:ascii="Segoe UI" w:hAnsi="Segoe UI" w:cs="Segoe UI"/>
-          <w:sz w:val="24"/>
-          <w:szCs w:val="24"/>
-        </w:rPr>
-        <w:tab/>
-        <w:t>{{LAST_PARA}}</w:t>
+        <w:t>PUC no. {{PUC_NUMBER}} dated {{PUC_DATE}} sent by {{PUC_SENDER}} and received through CFMS no. {{BRANCH_CFMS_NUMBER}} dated {{BRANCH_CFMS_DATE}}, may kindly be perused.</w:t>
       </w:r>
     </w:p>
     <w:p>
@@ -236,7 +191,39 @@
           <w:sz w:val="14"/>
           <w:szCs w:val="14"/>
         </w:rPr>
-        <w:t>(Deepak Soni)</w:t>
+        <w:t>(</w:t>
+      </w:r>
+      <w:r>
+        <w:rPr>
+          <w:rFonts w:ascii="Segoe UI" w:hAnsi="Segoe UI" w:cs="Segoe UI"/>
+          <w:sz w:val="14"/>
+          <w:szCs w:val="14"/>
+        </w:rPr>
+        <w:t>{{</w:t>
+      </w:r>
+      <w:r>
+        <w:rPr>
+          <w:rFonts w:ascii="Segoe UI" w:hAnsi="Segoe UI" w:cs="Segoe UI"/>
+          <w:sz w:val="14"/>
+          <w:szCs w:val="14"/>
+        </w:rPr>
+        <w:t>DEALING</w:t>
+      </w:r>
+      <w:r>
+        <w:rPr>
+          <w:rFonts w:ascii="Segoe UI" w:hAnsi="Segoe UI" w:cs="Segoe UI"/>
+          <w:sz w:val="14"/>
+          <w:szCs w:val="14"/>
+        </w:rPr>
+        <w:t>}}</w:t>
+      </w:r>
+      <w:r>
+        <w:rPr>
+          <w:rFonts w:ascii="Segoe UI" w:hAnsi="Segoe UI" w:cs="Segoe UI"/>
+          <w:sz w:val="14"/>
+          <w:szCs w:val="14"/>
+        </w:rPr>
+        <w:t>)</w:t>
       </w:r>
     </w:p>
     <w:p>
@@ -264,39 +251,55 @@
         <w:jc w:val="both"/>
         <w:rPr>
           <w:rFonts w:ascii="Segoe UI" w:hAnsi="Segoe UI" w:cs="Segoe UI"/>
-          <w:sz w:val="20"/>
-          <w:szCs w:val="20"/>
-        </w:rPr>
-      </w:pPr>
-      <w:r>
-        <w:rPr>
-          <w:rFonts w:ascii="Segoe UI" w:hAnsi="Segoe UI" w:cs="Segoe UI"/>
-          <w:sz w:val="14"/>
-          <w:szCs w:val="14"/>
-        </w:rPr>
-        <w:t>({{TODAY_DATE}})</w:t>
-      </w:r>
-      <w:r>
-        <w:rPr>
-          <w:rFonts w:ascii="Segoe UI" w:hAnsi="Segoe UI" w:cs="Segoe UI"/>
-          <w:sz w:val="16"/>
-          <w:szCs w:val="16"/>
+          <w:sz w:val="14"/>
+          <w:szCs w:val="14"/>
+        </w:rPr>
+      </w:pPr>
+      <w:r>
+        <w:rPr>
+          <w:rFonts w:ascii="Segoe UI" w:hAnsi="Segoe UI" w:cs="Segoe UI"/>
+          <w:sz w:val="14"/>
+          <w:szCs w:val="14"/>
+        </w:rPr>
+        <w:t>({{</w:t>
+      </w:r>
+      <w:r>
+        <w:rPr>
+          <w:rFonts w:ascii="Segoe UI" w:hAnsi="Segoe UI" w:cs="Segoe UI"/>
+          <w:sz w:val="14"/>
+          <w:szCs w:val="14"/>
+        </w:rPr>
+        <w:t xml:space="preserve">BRANCH_CFMS_DATE </w:t>
+      </w:r>
+      <w:r>
+        <w:rPr>
+          <w:rFonts w:ascii="Segoe UI" w:hAnsi="Segoe UI" w:cs="Segoe UI"/>
+          <w:sz w:val="14"/>
+          <w:szCs w:val="14"/>
+        </w:rPr>
+        <w:t>}})</w:t>
+      </w:r>
+      <w:r>
+        <w:rPr>
+          <w:rFonts w:ascii="Segoe UI" w:hAnsi="Segoe UI" w:cs="Segoe UI"/>
+          <w:sz w:val="14"/>
+          <w:szCs w:val="14"/>
         </w:rPr>
         <w:tab/>
       </w:r>
       <w:r>
         <w:rPr>
           <w:rFonts w:ascii="Segoe UI" w:hAnsi="Segoe UI" w:cs="Segoe UI"/>
-          <w:sz w:val="20"/>
-          <w:szCs w:val="20"/>
+          <w:sz w:val="14"/>
+          <w:szCs w:val="14"/>
         </w:rPr>
         <w:tab/>
       </w:r>
       <w:r>
         <w:rPr>
           <w:rFonts w:ascii="Segoe UI" w:hAnsi="Segoe UI" w:cs="Segoe UI"/>
-          <w:sz w:val="20"/>
-          <w:szCs w:val="20"/>
+          <w:sz w:val="14"/>
+          <w:szCs w:val="14"/>
         </w:rPr>
         <w:tab/>
       </w:r>

</xml_diff>